<commit_message>
feat: enable skill updates in builder, support docx downloads in success screen, and add configurable tab navigation to main shell
</commit_message>
<xml_diff>
--- a/tabashir-backend/templates/Arabic Docxtpl Compatible CV Template.docx
+++ b/tabashir-backend/templates/Arabic Docxtpl Compatible CV Template.docx
@@ -19,19 +19,25 @@
         <w:jc w:val="center"/>
       </w:pPr>
       <w:r>
-        <w:t>{{ header.location }} | {{ header.phone }}</w:t>
-        <w:br/>
+        <w:rPr>
+          <w:sz w:val="20"/>
+        </w:rPr>
+        <w:t>{% if header.location %}{{ header.location }} | {% endif %}{% if header.phone %}{{ header.phone }} | {% endif %}{% if email_text %}{{ email_text }}{% endif %}{% if linkedin_text %} | {{ linkedin_text }}{% endif %}{% if github_text %} | {{ github_text }}{% endif %}</w:t>
       </w:r>
+    </w:p>
+    <w:p>
       <w:r>
-        <w:t>{{ email_text }} | {{ linkedin_text }} | {{ github_text }}</w:t>
+        <w:t>{% if objective %}</w:t>
       </w:r>
     </w:p>
     <w:p>
       <w:pPr>
-        <w:pStyle w:val="Heading1"/>
+        <w:pBdr>
+          <w:bottom w:val="single" w:sz="6" w:space="1" w:color="000000"/>
+        </w:pBdr>
       </w:pPr>
       <w:r>
-        <w:t>CAREER OBJECTIVE</w:t>
+        <w:t>PROFESSIONAL SUMMARY</w:t>
       </w:r>
     </w:p>
     <w:p>
@@ -40,68 +46,20 @@
       </w:r>
     </w:p>
     <w:p>
-      <w:pPr>
-        <w:pStyle w:val="Heading1"/>
-      </w:pPr>
       <w:r>
-        <w:t>EDUCATION</w:t>
+        <w:t>{% endif %}</w:t>
       </w:r>
     </w:p>
     <w:p>
       <w:r>
-        <w:t>{% for edu in education_list %}</w:t>
+        <w:t>{% if work_list %}</w:t>
       </w:r>
     </w:p>
     <w:p>
       <w:pPr>
-        <w:jc w:val="left"/>
-      </w:pPr>
-      <w:r>
-        <w:rPr>
-          <w:b/>
-        </w:rPr>
-        <w:t>{{ edu.university }}</w:t>
-      </w:r>
-      <w:r>
-        <w:t>, {{ edu.location }}</w:t>
-        <w:tab/>
-        <w:t>{{ edu.date }}</w:t>
-      </w:r>
-    </w:p>
-    <w:p>
-      <w:r>
-        <w:t>{{ edu.degree }} in {{ edu.major }}</w:t>
-      </w:r>
-      <w:r>
-        <w:t xml:space="preserve"> | GPA: {{ edu.gpa_hidden }}</w:t>
-      </w:r>
-    </w:p>
-    <w:p>
-      <w:r>
-        <w:t>{% for detail in edu.details %}</w:t>
-      </w:r>
-    </w:p>
-    <w:p>
-      <w:pPr>
-        <w:pStyle w:val="ListBullet"/>
-      </w:pPr>
-      <w:r>
-        <w:t>• {{ detail }}</w:t>
-      </w:r>
-    </w:p>
-    <w:p>
-      <w:r>
-        <w:t>{% endfor %}</w:t>
-      </w:r>
-    </w:p>
-    <w:p>
-      <w:r>
-        <w:t>{% endfor %}</w:t>
-      </w:r>
-    </w:p>
-    <w:p>
-      <w:pPr>
-        <w:pStyle w:val="Heading1"/>
+        <w:pBdr>
+          <w:bottom w:val="single" w:sz="6" w:space="1" w:color="000000"/>
+        </w:pBdr>
       </w:pPr>
       <w:r>
         <w:t>WORK EXPERIENCE</w:t>
@@ -117,12 +75,16 @@
         <w:rPr>
           <w:b/>
         </w:rPr>
-        <w:t>{{ work.company }}</w:t>
+        <w:t>{{ work.position }}</w:t>
       </w:r>
       <w:r>
-        <w:t xml:space="preserve"> – {{ work.position }}</w:t>
-        <w:tab/>
-        <w:t>{{ work.date }}</w:t>
+        <w:rPr>
+          <w:i/>
+        </w:rPr>
+        <w:t>{% if work.company %} | {{ work.company }}{% endif %}</w:t>
+      </w:r>
+      <w:r>
+        <w:t>{% if work.location %} | {{ work.location }}{% endif %}{% if work.date %} | {{ work.date }}{% endif %}</w:t>
       </w:r>
     </w:p>
     <w:p>
@@ -135,7 +97,7 @@
         <w:pStyle w:val="ListBullet"/>
       </w:pPr>
       <w:r>
-        <w:t>• {{ detail }}</w:t>
+        <w:t>{{ detail }}</w:t>
       </w:r>
     </w:p>
     <w:p>
@@ -149,16 +111,28 @@
       </w:r>
     </w:p>
     <w:p>
-      <w:pPr>
-        <w:pStyle w:val="Heading1"/>
-      </w:pPr>
       <w:r>
-        <w:t>LEADERSHIP EXPERIENCE</w:t>
+        <w:t>{% endif %}</w:t>
       </w:r>
     </w:p>
     <w:p>
       <w:r>
-        <w:t>{% for lship in lship_list %}</w:t>
+        <w:t>{% if education_list %}</w:t>
+      </w:r>
+    </w:p>
+    <w:p>
+      <w:pPr>
+        <w:pBdr>
+          <w:bottom w:val="single" w:sz="6" w:space="1" w:color="000000"/>
+        </w:pBdr>
+      </w:pPr>
+      <w:r>
+        <w:t>EDUCATION</w:t>
+      </w:r>
+    </w:p>
+    <w:p>
+      <w:r>
+        <w:t>{% for edu in education_list %}</w:t>
       </w:r>
     </w:p>
     <w:p>
@@ -166,17 +140,36 @@
         <w:rPr>
           <w:b/>
         </w:rPr>
-        <w:t>{{ lship.company }}</w:t>
+        <w:t>{{ edu.degree }}{% if edu.major %} in {{ edu.major }}{% endif %}</w:t>
       </w:r>
       <w:r>
-        <w:t xml:space="preserve"> – {{ lship.position }}</w:t>
-        <w:tab/>
-        <w:t>{{ lship.date }}</w:t>
+        <w:rPr>
+          <w:i/>
+        </w:rPr>
+        <w:t>{% if edu.university %} | {{ edu.university }}{% endif %}</w:t>
+      </w:r>
+      <w:r>
+        <w:t>{% if edu.location %} | {{ edu.location }}{% endif %}{% if edu.date %} | {{ edu.date }}{% endif %}</w:t>
       </w:r>
     </w:p>
     <w:p>
       <w:r>
-        <w:t>{% for detail in lship.details %}</w:t>
+        <w:t>{% if edu.gpa and edu.gpa != 'None' %}</w:t>
+      </w:r>
+    </w:p>
+    <w:p>
+      <w:r>
+        <w:t>GPA: {{ edu.gpa }}</w:t>
+      </w:r>
+    </w:p>
+    <w:p>
+      <w:r>
+        <w:t>{% endif %}</w:t>
+      </w:r>
+    </w:p>
+    <w:p>
+      <w:r>
+        <w:t>{% for detail in edu.details %}</w:t>
       </w:r>
     </w:p>
     <w:p>
@@ -184,7 +177,25 @@
         <w:pStyle w:val="ListBullet"/>
       </w:pPr>
       <w:r>
-        <w:t>• {{ detail }}</w:t>
+        <w:t>{{ detail }}</w:t>
+      </w:r>
+    </w:p>
+    <w:p>
+      <w:r>
+        <w:t>{% endfor %}</w:t>
+      </w:r>
+    </w:p>
+    <w:p>
+      <w:r>
+        <w:t>{% for course in edu.coursework %}</w:t>
+      </w:r>
+    </w:p>
+    <w:p>
+      <w:pPr>
+        <w:pStyle w:val="ListBullet"/>
+      </w:pPr>
+      <w:r>
+        <w:t>Coursework: {{ course }}</w:t>
       </w:r>
     </w:p>
     <w:p>
@@ -198,8 +209,20 @@
       </w:r>
     </w:p>
     <w:p>
+      <w:r>
+        <w:t>{% endif %}</w:t>
+      </w:r>
+    </w:p>
+    <w:p>
+      <w:r>
+        <w:t>{% if project_list %}</w:t>
+      </w:r>
+    </w:p>
+    <w:p>
       <w:pPr>
-        <w:pStyle w:val="Heading1"/>
+        <w:pBdr>
+          <w:bottom w:val="single" w:sz="6" w:space="1" w:color="000000"/>
+        </w:pBdr>
       </w:pPr>
       <w:r>
         <w:t>PROJECTS</w:t>
@@ -218,9 +241,7 @@
         <w:t>{{ project.title }}</w:t>
       </w:r>
       <w:r>
-        <w:t xml:space="preserve"> – {{ project.position }}</w:t>
-        <w:tab/>
-        <w:t>{{ project.date }}</w:t>
+        <w:t>{% if project.date %} | {{ project.date }}{% endif %}</w:t>
       </w:r>
     </w:p>
     <w:p>
@@ -233,7 +254,7 @@
         <w:pStyle w:val="ListBullet"/>
       </w:pPr>
       <w:r>
-        <w:t>• {{ detail }}</w:t>
+        <w:t>{{ detail }}</w:t>
       </w:r>
     </w:p>
     <w:p>
@@ -247,22 +268,28 @@
       </w:r>
     </w:p>
     <w:p>
-      <w:pPr>
-        <w:pStyle w:val="Heading1"/>
-      </w:pPr>
       <w:r>
-        <w:t>SKILLS &amp; TRAINING</w:t>
+        <w:t>{% endif %}</w:t>
       </w:r>
     </w:p>
     <w:p>
       <w:r>
-        <w:rPr>
-          <w:b/>
-        </w:rPr>
-        <w:t xml:space="preserve">Soft Skills: </w:t>
+        <w:t>{% if skills.skillset or skills.softskills or languages %}</w:t>
       </w:r>
+    </w:p>
+    <w:p>
+      <w:pPr>
+        <w:pBdr>
+          <w:bottom w:val="single" w:sz="6" w:space="1" w:color="000000"/>
+        </w:pBdr>
+      </w:pPr>
       <w:r>
-        <w:t>{% for skill in skills.softskills %}{{ skill }}{% if not loop.last %}, {% endif %}{% endfor %}</w:t>
+        <w:t>SKILLS &amp; COMPETENCIES</w:t>
+      </w:r>
+    </w:p>
+    <w:p>
+      <w:r>
+        <w:t>{% if skills.skillset %}</w:t>
       </w:r>
     </w:p>
     <w:p>
@@ -273,7 +300,17 @@
         <w:t xml:space="preserve">Technical Skills: </w:t>
       </w:r>
       <w:r>
-        <w:t>{% for skill in skills.skillset %}{{ skill }}{% if not loop.last %}, {% endif %}{% endfor %}</w:t>
+        <w:t>{{ skills.skillset|join(', ') }}</w:t>
+      </w:r>
+    </w:p>
+    <w:p>
+      <w:r>
+        <w:t>{% endif %}</w:t>
+      </w:r>
+    </w:p>
+    <w:p>
+      <w:r>
+        <w:t>{% if skills.softskills %}</w:t>
       </w:r>
     </w:p>
     <w:p>
@@ -281,28 +318,46 @@
         <w:rPr>
           <w:b/>
         </w:rPr>
-        <w:t xml:space="preserve">Training: </w:t>
+        <w:t xml:space="preserve">Core Competencies: </w:t>
       </w:r>
       <w:r>
-        <w:t>{% for item in skills.training %}{{ item }}{% if not loop.last %}, {% endif %}{% endfor %}</w:t>
-      </w:r>
-    </w:p>
-    <w:p>
-      <w:pPr>
-        <w:pStyle w:val="Heading1"/>
-      </w:pPr>
-      <w:r>
-        <w:t>LANGUAGES</w:t>
+        <w:t>{{ skills.softskills|join(', ') }}</w:t>
       </w:r>
     </w:p>
     <w:p>
       <w:r>
-        <w:t>{% for lang in languages %}{{ lang }}{% if not loop.last %}, {% endif %}{% endfor %}</w:t>
+        <w:t>{% endif %}</w:t>
+      </w:r>
+    </w:p>
+    <w:p>
+      <w:r>
+        <w:t>{% if languages %}</w:t>
+      </w:r>
+    </w:p>
+    <w:p>
+      <w:r>
+        <w:rPr>
+          <w:b/>
+        </w:rPr>
+        <w:t xml:space="preserve">Languages: </w:t>
+      </w:r>
+      <w:r>
+        <w:t>{{ languages|join(', ') }}</w:t>
+      </w:r>
+    </w:p>
+    <w:p>
+      <w:r>
+        <w:t>{% endif %}</w:t>
+      </w:r>
+    </w:p>
+    <w:p>
+      <w:r>
+        <w:t>{% endif %}</w:t>
       </w:r>
     </w:p>
     <w:sectPr>
       <w:pgSz w:w="12240" w:h="15840"/>
-      <w:pgMar w:top="1440" w:right="1800" w:bottom="1440" w:left="1800" w:header="720" w:footer="720" w:gutter="0"/>
+      <w:pgMar w:top="1080" w:right="1080" w:bottom="1080" w:left="1080" w:header="720" w:footer="720" w:gutter="0"/>
       <w:cols w:space="720"/>
       <w:docGrid w:linePitch="360"/>
     </w:sectPr>
@@ -674,8 +729,9 @@
     <w:qFormat/>
     <w:rsid w:val="00FC693F"/>
     <w:rPr>
-      <w:rFonts w:ascii="Times New Roman" w:hAnsi="Times New Roman"/>
-      <w:sz w:val="22"/>
+      <w:rFonts w:ascii="Calibri" w:hAnsi="Calibri"/>
+      <w:b/>
+      <w:sz w:val="24"/>
     </w:rPr>
   </w:style>
   <w:style w:type="paragraph" w:styleId="Header">

</xml_diff>

<commit_message>
feat: enhance CV template generation with leadership sections, date formatting, and bullet point cleaning
</commit_message>
<xml_diff>
--- a/tabashir-backend/templates/Arabic Docxtpl Compatible CV Template.docx
+++ b/tabashir-backend/templates/Arabic Docxtpl Compatible CV Template.docx
@@ -5,6 +5,7 @@
     <w:p>
       <w:pPr>
         <w:jc w:val="center"/>
+        <w:bidi w:val="1"/>
       </w:pPr>
       <w:r>
         <w:rPr>
@@ -17,12 +18,13 @@
     <w:p>
       <w:pPr>
         <w:jc w:val="center"/>
+        <w:bidi w:val="1"/>
       </w:pPr>
       <w:r>
         <w:rPr>
           <w:sz w:val="20"/>
         </w:rPr>
-        <w:t>{% if header.location %}{{ header.location }} | {% endif %}{% if header.phone %}{{ header.phone }} | {% endif %}{% if email_text %}{{ email_text }}{% endif %}{% if linkedin_text %} | {{ linkedin_text }}{% endif %}{% if github_text %} | {{ github_text }}{% endif %}</w:t>
+        <w:t>{{ contact_info }}</w:t>
       </w:r>
     </w:p>
     <w:p>
@@ -35,12 +37,18 @@
         <w:pBdr>
           <w:bottom w:val="single" w:sz="6" w:space="1" w:color="000000"/>
         </w:pBdr>
+        <w:bidi w:val="1"/>
+        <w:jc w:val="right"/>
       </w:pPr>
       <w:r>
-        <w:t>PROFESSIONAL SUMMARY</w:t>
+        <w:t>الملخص المهني</w:t>
       </w:r>
     </w:p>
     <w:p>
+      <w:pPr>
+        <w:bidi w:val="1"/>
+        <w:jc w:val="right"/>
+      </w:pPr>
       <w:r>
         <w:t>{{ objective }}</w:t>
       </w:r>
@@ -60,9 +68,11 @@
         <w:pBdr>
           <w:bottom w:val="single" w:sz="6" w:space="1" w:color="000000"/>
         </w:pBdr>
+        <w:bidi w:val="1"/>
+        <w:jc w:val="right"/>
       </w:pPr>
       <w:r>
-        <w:t>WORK EXPERIENCE</w:t>
+        <w:t>الخبرة المهنية</w:t>
       </w:r>
     </w:p>
     <w:p>
@@ -71,6 +81,10 @@
       </w:r>
     </w:p>
     <w:p>
+      <w:pPr>
+        <w:bidi w:val="1"/>
+        <w:jc w:val="right"/>
+      </w:pPr>
       <w:r>
         <w:rPr>
           <w:b/>
@@ -95,6 +109,81 @@
     <w:p>
       <w:pPr>
         <w:pStyle w:val="ListBullet"/>
+        <w:bidi w:val="1"/>
+        <w:jc w:val="right"/>
+      </w:pPr>
+      <w:r>
+        <w:t>{{ detail }}</w:t>
+      </w:r>
+    </w:p>
+    <w:p>
+      <w:r>
+        <w:t>{% endfor %}</w:t>
+      </w:r>
+    </w:p>
+    <w:p>
+      <w:r>
+        <w:t>{% endfor %}</w:t>
+      </w:r>
+    </w:p>
+    <w:p>
+      <w:r>
+        <w:t>{% endif %}</w:t>
+      </w:r>
+    </w:p>
+    <w:p>
+      <w:r>
+        <w:t>{% if lship_list %}</w:t>
+      </w:r>
+    </w:p>
+    <w:p>
+      <w:pPr>
+        <w:pBdr>
+          <w:bottom w:val="single" w:sz="6" w:space="1" w:color="000000"/>
+        </w:pBdr>
+        <w:bidi w:val="1"/>
+        <w:jc w:val="right"/>
+      </w:pPr>
+      <w:r>
+        <w:t>الخبرة القيادية</w:t>
+      </w:r>
+    </w:p>
+    <w:p>
+      <w:r>
+        <w:t>{% for lship in lship_list %}</w:t>
+      </w:r>
+    </w:p>
+    <w:p>
+      <w:pPr>
+        <w:bidi w:val="1"/>
+        <w:jc w:val="right"/>
+      </w:pPr>
+      <w:r>
+        <w:rPr>
+          <w:b/>
+        </w:rPr>
+        <w:t>{{ lship.position }}</w:t>
+      </w:r>
+      <w:r>
+        <w:rPr>
+          <w:i/>
+        </w:rPr>
+        <w:t>{% if lship.company %} | {{ lship.company }}{% endif %}</w:t>
+      </w:r>
+      <w:r>
+        <w:t>{% if lship.location %} | {{ lship.location }}{% endif %}{% if lship.date %} | {{ lship.date }}{% endif %}</w:t>
+      </w:r>
+    </w:p>
+    <w:p>
+      <w:r>
+        <w:t>{% for detail in lship.details %}</w:t>
+      </w:r>
+    </w:p>
+    <w:p>
+      <w:pPr>
+        <w:pStyle w:val="ListBullet"/>
+        <w:bidi w:val="1"/>
+        <w:jc w:val="right"/>
       </w:pPr>
       <w:r>
         <w:t>{{ detail }}</w:t>
@@ -125,9 +214,11 @@
         <w:pBdr>
           <w:bottom w:val="single" w:sz="6" w:space="1" w:color="000000"/>
         </w:pBdr>
+        <w:bidi w:val="1"/>
+        <w:jc w:val="right"/>
       </w:pPr>
       <w:r>
-        <w:t>EDUCATION</w:t>
+        <w:t>التعليم</w:t>
       </w:r>
     </w:p>
     <w:p>
@@ -136,11 +227,15 @@
       </w:r>
     </w:p>
     <w:p>
+      <w:pPr>
+        <w:bidi w:val="1"/>
+        <w:jc w:val="right"/>
+      </w:pPr>
       <w:r>
         <w:rPr>
           <w:b/>
         </w:rPr>
-        <w:t>{{ edu.degree }}{% if edu.major %} in {{ edu.major }}{% endif %}</w:t>
+        <w:t>{{ edu.degree }}{% if edu.major %} في {{ edu.major }}{% endif %}</w:t>
       </w:r>
       <w:r>
         <w:rPr>
@@ -158,8 +253,12 @@
       </w:r>
     </w:p>
     <w:p>
+      <w:pPr>
+        <w:bidi w:val="1"/>
+        <w:jc w:val="right"/>
+      </w:pPr>
       <w:r>
-        <w:t>GPA: {{ edu.gpa }}</w:t>
+        <w:t>المعدل: {{ edu.gpa }}</w:t>
       </w:r>
     </w:p>
     <w:p>
@@ -175,6 +274,8 @@
     <w:p>
       <w:pPr>
         <w:pStyle w:val="ListBullet"/>
+        <w:bidi w:val="1"/>
+        <w:jc w:val="right"/>
       </w:pPr>
       <w:r>
         <w:t>{{ detail }}</w:t>
@@ -193,9 +294,11 @@
     <w:p>
       <w:pPr>
         <w:pStyle w:val="ListBullet"/>
+        <w:bidi w:val="1"/>
+        <w:jc w:val="right"/>
       </w:pPr>
       <w:r>
-        <w:t>Coursework: {{ course }}</w:t>
+        <w:t>الدورات: {{ course }}</w:t>
       </w:r>
     </w:p>
     <w:p>
@@ -223,9 +326,11 @@
         <w:pBdr>
           <w:bottom w:val="single" w:sz="6" w:space="1" w:color="000000"/>
         </w:pBdr>
+        <w:bidi w:val="1"/>
+        <w:jc w:val="right"/>
       </w:pPr>
       <w:r>
-        <w:t>PROJECTS</w:t>
+        <w:t>المشاريع</w:t>
       </w:r>
     </w:p>
     <w:p>
@@ -234,6 +339,10 @@
       </w:r>
     </w:p>
     <w:p>
+      <w:pPr>
+        <w:bidi w:val="1"/>
+        <w:jc w:val="right"/>
+      </w:pPr>
       <w:r>
         <w:rPr>
           <w:b/>
@@ -252,6 +361,8 @@
     <w:p>
       <w:pPr>
         <w:pStyle w:val="ListBullet"/>
+        <w:bidi w:val="1"/>
+        <w:jc w:val="right"/>
       </w:pPr>
       <w:r>
         <w:t>{{ detail }}</w:t>
@@ -282,9 +393,11 @@
         <w:pBdr>
           <w:bottom w:val="single" w:sz="6" w:space="1" w:color="000000"/>
         </w:pBdr>
+        <w:bidi w:val="1"/>
+        <w:jc w:val="right"/>
       </w:pPr>
       <w:r>
-        <w:t>SKILLS &amp; COMPETENCIES</w:t>
+        <w:t>المهارات والكفاءات</w:t>
       </w:r>
     </w:p>
     <w:p>
@@ -293,14 +406,18 @@
       </w:r>
     </w:p>
     <w:p>
+      <w:pPr>
+        <w:bidi w:val="1"/>
+        <w:jc w:val="right"/>
+      </w:pPr>
       <w:r>
         <w:rPr>
           <w:b/>
         </w:rPr>
-        <w:t xml:space="preserve">Technical Skills: </w:t>
+        <w:t xml:space="preserve">المهارات التقنية: </w:t>
       </w:r>
       <w:r>
-        <w:t>{{ skills.skillset|join(', ') }}</w:t>
+        <w:t>{{ skills.skillset|join('، ') }}</w:t>
       </w:r>
     </w:p>
     <w:p>
@@ -314,14 +431,18 @@
       </w:r>
     </w:p>
     <w:p>
+      <w:pPr>
+        <w:bidi w:val="1"/>
+        <w:jc w:val="right"/>
+      </w:pPr>
       <w:r>
         <w:rPr>
           <w:b/>
         </w:rPr>
-        <w:t xml:space="preserve">Core Competencies: </w:t>
+        <w:t xml:space="preserve">الكفاءات الأساسية: </w:t>
       </w:r>
       <w:r>
-        <w:t>{{ skills.softskills|join(', ') }}</w:t>
+        <w:t>{{ skills.softskills|join('، ') }}</w:t>
       </w:r>
     </w:p>
     <w:p>
@@ -335,14 +456,43 @@
       </w:r>
     </w:p>
     <w:p>
+      <w:pPr>
+        <w:bidi w:val="1"/>
+        <w:jc w:val="right"/>
+      </w:pPr>
       <w:r>
         <w:rPr>
           <w:b/>
         </w:rPr>
-        <w:t xml:space="preserve">Languages: </w:t>
+        <w:t xml:space="preserve">اللغات: </w:t>
       </w:r>
       <w:r>
-        <w:t>{{ languages|join(', ') }}</w:t>
+        <w:t>{{ languages|join('، ') }}</w:t>
+      </w:r>
+    </w:p>
+    <w:p>
+      <w:r>
+        <w:t>{% endif %}</w:t>
+      </w:r>
+    </w:p>
+    <w:p>
+      <w:r>
+        <w:t>{% if skills.training %}</w:t>
+      </w:r>
+    </w:p>
+    <w:p>
+      <w:pPr>
+        <w:bidi w:val="1"/>
+        <w:jc w:val="right"/>
+      </w:pPr>
+      <w:r>
+        <w:rPr>
+          <w:b/>
+        </w:rPr>
+        <w:t xml:space="preserve">التدريب والشهادات: </w:t>
+      </w:r>
+      <w:r>
+        <w:t>{{ skills.training|join('، ') }}</w:t>
       </w:r>
     </w:p>
     <w:p>
@@ -729,7 +879,7 @@
     <w:qFormat/>
     <w:rsid w:val="00FC693F"/>
     <w:rPr>
-      <w:rFonts w:ascii="Calibri" w:hAnsi="Calibri"/>
+      <w:rFonts w:ascii="Arial" w:hAnsi="Arial"/>
       <w:b/>
       <w:sz w:val="24"/>
     </w:rPr>

</xml_diff>

<commit_message>
feat: update resume project model with extended fields and add leadership section support
</commit_message>
<xml_diff>
--- a/tabashir-backend/templates/Arabic Docxtpl Compatible CV Template.docx
+++ b/tabashir-backend/templates/Arabic Docxtpl Compatible CV Template.docx
@@ -350,7 +350,13 @@
         <w:t>{{ project.title }}</w:t>
       </w:r>
       <w:r>
-        <w:t>{% if project.date %} | {{ project.date }}{% endif %}</w:t>
+        <w:rPr>
+          <w:i/>
+        </w:rPr>
+        <w:t>{% if project.position %} | {{ project.position }}{% endif %}</w:t>
+      </w:r>
+      <w:r>
+        <w:t>{% if project.location %} | {{ project.location }}{% endif %}{% if project.date %} | {{ project.date }}{% endif %}</w:t>
       </w:r>
     </w:p>
     <w:p>

</xml_diff>

<commit_message>
fix: improve RTL text rendering in Arabic CV templates and update file naming and mock data testing tools
</commit_message>
<xml_diff>
--- a/tabashir-backend/templates/Arabic Docxtpl Compatible CV Template.docx
+++ b/tabashir-backend/templates/Arabic Docxtpl Compatible CV Template.docx
@@ -4,8 +4,8 @@
   <w:body>
     <w:p>
       <w:pPr>
+        <w:bidi w:val="1"/>
         <w:jc w:val="center"/>
-        <w:bidi w:val="1"/>
       </w:pPr>
       <w:r>
         <w:rPr>
@@ -17,8 +17,8 @@
     </w:p>
     <w:p>
       <w:pPr>
+        <w:bidi w:val="1"/>
         <w:jc w:val="center"/>
-        <w:bidi w:val="1"/>
       </w:pPr>
       <w:r>
         <w:rPr>
@@ -108,12 +108,11 @@
     </w:p>
     <w:p>
       <w:pPr>
-        <w:pStyle w:val="ListBullet"/>
         <w:bidi w:val="1"/>
         <w:jc w:val="right"/>
       </w:pPr>
       <w:r>
-        <w:t>{{ detail }}</w:t>
+        <w:t>•  {{ detail }}</w:t>
       </w:r>
     </w:p>
     <w:p>
@@ -181,12 +180,11 @@
     </w:p>
     <w:p>
       <w:pPr>
-        <w:pStyle w:val="ListBullet"/>
         <w:bidi w:val="1"/>
         <w:jc w:val="right"/>
       </w:pPr>
       <w:r>
-        <w:t>{{ detail }}</w:t>
+        <w:t>•  {{ detail }}</w:t>
       </w:r>
     </w:p>
     <w:p>
@@ -273,12 +271,11 @@
     </w:p>
     <w:p>
       <w:pPr>
-        <w:pStyle w:val="ListBullet"/>
         <w:bidi w:val="1"/>
         <w:jc w:val="right"/>
       </w:pPr>
       <w:r>
-        <w:t>{{ detail }}</w:t>
+        <w:t>•  {{ detail }}</w:t>
       </w:r>
     </w:p>
     <w:p>
@@ -293,12 +290,11 @@
     </w:p>
     <w:p>
       <w:pPr>
-        <w:pStyle w:val="ListBullet"/>
         <w:bidi w:val="1"/>
         <w:jc w:val="right"/>
       </w:pPr>
       <w:r>
-        <w:t>الدورات: {{ course }}</w:t>
+        <w:t>•  الدورات: {{ course }}</w:t>
       </w:r>
     </w:p>
     <w:p>
@@ -366,12 +362,11 @@
     </w:p>
     <w:p>
       <w:pPr>
-        <w:pStyle w:val="ListBullet"/>
         <w:bidi w:val="1"/>
         <w:jc w:val="right"/>
       </w:pPr>
       <w:r>
-        <w:t>{{ detail }}</w:t>
+        <w:t>•  {{ detail }}</w:t>
       </w:r>
     </w:p>
     <w:p>

</xml_diff>

<commit_message>
refactor: update arabic template generation to inject explicit RTL run properties for improved docx formatting
</commit_message>
<xml_diff>
--- a/tabashir-backend/templates/Arabic Docxtpl Compatible CV Template.docx
+++ b/tabashir-backend/templates/Arabic Docxtpl Compatible CV Template.docx
@@ -11,6 +11,7 @@
         <w:rPr>
           <w:b/>
           <w:sz w:val="32"/>
+          <w:rtl w:val="1"/>
         </w:rPr>
         <w:t>{{ header.name }}</w:t>
       </w:r>
@@ -23,6 +24,7 @@
       <w:r>
         <w:rPr>
           <w:sz w:val="20"/>
+          <w:rtl w:val="1"/>
         </w:rPr>
         <w:t>{{ contact_info }}</w:t>
       </w:r>
@@ -41,6 +43,11 @@
         <w:jc w:val="right"/>
       </w:pPr>
       <w:r>
+        <w:rPr>
+          <w:b/>
+          <w:sz w:val="24"/>
+          <w:rtl w:val="1"/>
+        </w:rPr>
         <w:t>الملخص المهني</w:t>
       </w:r>
     </w:p>
@@ -50,6 +57,9 @@
         <w:jc w:val="right"/>
       </w:pPr>
       <w:r>
+        <w:rPr>
+          <w:rtl w:val="1"/>
+        </w:rPr>
         <w:t>{{ objective }}</w:t>
       </w:r>
     </w:p>
@@ -72,6 +82,11 @@
         <w:jc w:val="right"/>
       </w:pPr>
       <w:r>
+        <w:rPr>
+          <w:b/>
+          <w:sz w:val="24"/>
+          <w:rtl w:val="1"/>
+        </w:rPr>
         <w:t>الخبرة المهنية</w:t>
       </w:r>
     </w:p>
@@ -88,16 +103,21 @@
       <w:r>
         <w:rPr>
           <w:b/>
+          <w:rtl w:val="1"/>
         </w:rPr>
         <w:t>{{ work.position }}</w:t>
       </w:r>
       <w:r>
         <w:rPr>
           <w:i/>
+          <w:rtl w:val="1"/>
         </w:rPr>
         <w:t>{% if work.company %} | {{ work.company }}{% endif %}</w:t>
       </w:r>
       <w:r>
+        <w:rPr>
+          <w:rtl w:val="1"/>
+        </w:rPr>
         <w:t>{% if work.location %} | {{ work.location }}{% endif %}{% if work.date %} | {{ work.date }}{% endif %}</w:t>
       </w:r>
     </w:p>
@@ -112,6 +132,9 @@
         <w:jc w:val="right"/>
       </w:pPr>
       <w:r>
+        <w:rPr>
+          <w:rtl w:val="1"/>
+        </w:rPr>
         <w:t>•  {{ detail }}</w:t>
       </w:r>
     </w:p>
@@ -144,6 +167,11 @@
         <w:jc w:val="right"/>
       </w:pPr>
       <w:r>
+        <w:rPr>
+          <w:b/>
+          <w:sz w:val="24"/>
+          <w:rtl w:val="1"/>
+        </w:rPr>
         <w:t>الخبرة القيادية</w:t>
       </w:r>
     </w:p>
@@ -160,16 +188,21 @@
       <w:r>
         <w:rPr>
           <w:b/>
+          <w:rtl w:val="1"/>
         </w:rPr>
         <w:t>{{ lship.position }}</w:t>
       </w:r>
       <w:r>
         <w:rPr>
           <w:i/>
+          <w:rtl w:val="1"/>
         </w:rPr>
         <w:t>{% if lship.company %} | {{ lship.company }}{% endif %}</w:t>
       </w:r>
       <w:r>
+        <w:rPr>
+          <w:rtl w:val="1"/>
+        </w:rPr>
         <w:t>{% if lship.location %} | {{ lship.location }}{% endif %}{% if lship.date %} | {{ lship.date }}{% endif %}</w:t>
       </w:r>
     </w:p>
@@ -184,6 +217,9 @@
         <w:jc w:val="right"/>
       </w:pPr>
       <w:r>
+        <w:rPr>
+          <w:rtl w:val="1"/>
+        </w:rPr>
         <w:t>•  {{ detail }}</w:t>
       </w:r>
     </w:p>
@@ -216,6 +252,11 @@
         <w:jc w:val="right"/>
       </w:pPr>
       <w:r>
+        <w:rPr>
+          <w:b/>
+          <w:sz w:val="24"/>
+          <w:rtl w:val="1"/>
+        </w:rPr>
         <w:t>التعليم</w:t>
       </w:r>
     </w:p>
@@ -232,16 +273,21 @@
       <w:r>
         <w:rPr>
           <w:b/>
+          <w:rtl w:val="1"/>
         </w:rPr>
         <w:t>{{ edu.degree }}{% if edu.major %} في {{ edu.major }}{% endif %}</w:t>
       </w:r>
       <w:r>
         <w:rPr>
           <w:i/>
+          <w:rtl w:val="1"/>
         </w:rPr>
         <w:t>{% if edu.university %} | {{ edu.university }}{% endif %}</w:t>
       </w:r>
       <w:r>
+        <w:rPr>
+          <w:rtl w:val="1"/>
+        </w:rPr>
         <w:t>{% if edu.location %} | {{ edu.location }}{% endif %}{% if edu.date %} | {{ edu.date }}{% endif %}</w:t>
       </w:r>
     </w:p>
@@ -256,6 +302,9 @@
         <w:jc w:val="right"/>
       </w:pPr>
       <w:r>
+        <w:rPr>
+          <w:rtl w:val="1"/>
+        </w:rPr>
         <w:t>المعدل: {{ edu.gpa }}</w:t>
       </w:r>
     </w:p>
@@ -275,6 +324,9 @@
         <w:jc w:val="right"/>
       </w:pPr>
       <w:r>
+        <w:rPr>
+          <w:rtl w:val="1"/>
+        </w:rPr>
         <w:t>•  {{ detail }}</w:t>
       </w:r>
     </w:p>
@@ -294,6 +346,9 @@
         <w:jc w:val="right"/>
       </w:pPr>
       <w:r>
+        <w:rPr>
+          <w:rtl w:val="1"/>
+        </w:rPr>
         <w:t>•  الدورات: {{ course }}</w:t>
       </w:r>
     </w:p>
@@ -326,6 +381,11 @@
         <w:jc w:val="right"/>
       </w:pPr>
       <w:r>
+        <w:rPr>
+          <w:b/>
+          <w:sz w:val="24"/>
+          <w:rtl w:val="1"/>
+        </w:rPr>
         <w:t>المشاريع</w:t>
       </w:r>
     </w:p>
@@ -342,16 +402,21 @@
       <w:r>
         <w:rPr>
           <w:b/>
+          <w:rtl w:val="1"/>
         </w:rPr>
         <w:t>{{ project.title }}</w:t>
       </w:r>
       <w:r>
         <w:rPr>
           <w:i/>
+          <w:rtl w:val="1"/>
         </w:rPr>
         <w:t>{% if project.position %} | {{ project.position }}{% endif %}</w:t>
       </w:r>
       <w:r>
+        <w:rPr>
+          <w:rtl w:val="1"/>
+        </w:rPr>
         <w:t>{% if project.location %} | {{ project.location }}{% endif %}{% if project.date %} | {{ project.date }}{% endif %}</w:t>
       </w:r>
     </w:p>
@@ -366,6 +431,9 @@
         <w:jc w:val="right"/>
       </w:pPr>
       <w:r>
+        <w:rPr>
+          <w:rtl w:val="1"/>
+        </w:rPr>
         <w:t>•  {{ detail }}</w:t>
       </w:r>
     </w:p>
@@ -398,6 +466,11 @@
         <w:jc w:val="right"/>
       </w:pPr>
       <w:r>
+        <w:rPr>
+          <w:b/>
+          <w:sz w:val="24"/>
+          <w:rtl w:val="1"/>
+        </w:rPr>
         <w:t>المهارات والكفاءات</w:t>
       </w:r>
     </w:p>
@@ -414,10 +487,14 @@
       <w:r>
         <w:rPr>
           <w:b/>
+          <w:rtl w:val="1"/>
         </w:rPr>
         <w:t xml:space="preserve">المهارات التقنية: </w:t>
       </w:r>
       <w:r>
+        <w:rPr>
+          <w:rtl w:val="1"/>
+        </w:rPr>
         <w:t>{{ skills.skillset|join('، ') }}</w:t>
       </w:r>
     </w:p>
@@ -439,10 +516,14 @@
       <w:r>
         <w:rPr>
           <w:b/>
+          <w:rtl w:val="1"/>
         </w:rPr>
         <w:t xml:space="preserve">الكفاءات الأساسية: </w:t>
       </w:r>
       <w:r>
+        <w:rPr>
+          <w:rtl w:val="1"/>
+        </w:rPr>
         <w:t>{{ skills.softskills|join('، ') }}</w:t>
       </w:r>
     </w:p>
@@ -464,10 +545,14 @@
       <w:r>
         <w:rPr>
           <w:b/>
+          <w:rtl w:val="1"/>
         </w:rPr>
         <w:t xml:space="preserve">اللغات: </w:t>
       </w:r>
       <w:r>
+        <w:rPr>
+          <w:rtl w:val="1"/>
+        </w:rPr>
         <w:t>{{ languages|join('، ') }}</w:t>
       </w:r>
     </w:p>
@@ -489,10 +574,14 @@
       <w:r>
         <w:rPr>
           <w:b/>
+          <w:rtl w:val="1"/>
         </w:rPr>
         <w:t xml:space="preserve">التدريب والشهادات: </w:t>
       </w:r>
       <w:r>
+        <w:rPr>
+          <w:rtl w:val="1"/>
+        </w:rPr>
         <w:t>{{ skills.training|join('، ') }}</w:t>
       </w:r>
     </w:p>
@@ -881,8 +970,7 @@
     <w:rsid w:val="00FC693F"/>
     <w:rPr>
       <w:rFonts w:ascii="Arial" w:hAnsi="Arial"/>
-      <w:b/>
-      <w:sz w:val="24"/>
+      <w:sz w:val="22"/>
     </w:rPr>
   </w:style>
   <w:style w:type="paragraph" w:styleId="Header">

</xml_diff>